<commit_message>
fix: filtrage NON-SACEM et recalcul PH sur 100%
- [credits] : inclut tous les éditeurs (SACEM + NON-SACEM)
- [editsplit] : recalcul sur 100% part éditeur SACEM
- {auteurspart}/{editeurspart} : PH recalculé sur 100%
- {subpart}/{licpart} : filtre IsSACEMMember ajouté
</commit_message>
<xml_diff>
--- a/templates/COED_template_univ.docx
+++ b/templates/COED_template_univ.docx
@@ -703,29 +703,43 @@
       <w:pPr>
         <w:spacing w:after="3"/>
         <w:ind w:left="0" w:right="27" w:firstLine="0"/>
-        <w:rPr>
-          <w:color w:val="FF0000"/>
-        </w:rPr>
-      </w:pPr>
-      <w:r>
-        <w:rPr>
-          <w:color w:val="FF0000"/>
-        </w:rPr>
-        <w:t>{</w:t>
-      </w:r>
-      <w:proofErr w:type="spellStart"/>
-      <w:r>
-        <w:rPr>
-          <w:color w:val="FF0000"/>
-        </w:rPr>
-        <w:t>Mention_COED_NonSACEM</w:t>
-      </w:r>
-      <w:proofErr w:type="spellEnd"/>
-      <w:r>
-        <w:rPr>
-          <w:color w:val="FF0000"/>
-        </w:rPr>
-        <w:t>}</w:t>
+        <w:jc w:val="center"/>
+        <w:rPr>
+          <w:color w:val="FF0000"/>
+        </w:rPr>
+      </w:pPr>
+    </w:p>
+    <w:p>
+      <w:pPr>
+        <w:spacing w:after="3"/>
+        <w:ind w:left="0" w:right="27" w:firstLine="0"/>
+        <w:rPr>
+          <w:rFonts w:ascii="Cambria" w:eastAsia="Cambria" w:hAnsi="Cambria" w:cs="Cambria"/>
+          <w:color w:val="EE0000"/>
+        </w:rPr>
+      </w:pPr>
+      <w:r>
+        <w:rPr>
+          <w:rFonts w:ascii="Cambria" w:eastAsia="Cambria" w:hAnsi="Cambria" w:cs="Cambria"/>
+          <w:color w:val="EE0000"/>
+        </w:rPr>
+        <w:t>{MENTION_NONSACEM}</w:t>
+      </w:r>
+    </w:p>
+    <w:p>
+      <w:pPr>
+        <w:spacing w:after="3"/>
+        <w:ind w:left="0" w:right="27" w:firstLine="0"/>
+        <w:rPr>
+          <w:color w:val="EE0000"/>
+        </w:rPr>
+      </w:pPr>
+      <w:r>
+        <w:rPr>
+          <w:rFonts w:ascii="Cambria" w:eastAsia="Cambria" w:hAnsi="Cambria" w:cs="Cambria"/>
+          <w:color w:val="EE0000"/>
+        </w:rPr>
+        <w:t>{LIST_NONSACEM}</w:t>
       </w:r>
     </w:p>
     <w:p>
@@ -986,6 +1000,7 @@
         </w:rPr>
       </w:pPr>
       <w:r>
+        <w:lastRenderedPageBreak/>
         <w:t>ARTICLE 6 – FRAIS D’EXPLOITATION ET DÉPENSES</w:t>
       </w:r>
     </w:p>
@@ -1046,7 +1061,6 @@
         <w:ind w:left="0" w:right="27" w:firstLine="0"/>
       </w:pPr>
       <w:r>
-        <w:lastRenderedPageBreak/>
         <w:t>Les frais et dépenses engagés pour la promotion et l’exploitation de l’</w:t>
       </w:r>
       <w:r>
@@ -1887,6 +1901,7 @@
         <w:ind w:left="0" w:right="27" w:firstLine="0"/>
       </w:pPr>
       <w:r>
+        <w:lastRenderedPageBreak/>
         <w:t xml:space="preserve">Il est convenu que les paiements seront suspendus tant que le montant des sommes dues sera inférieur à </w:t>
       </w:r>
       <w:r>
@@ -1918,7 +1933,6 @@
           <w:bCs/>
           <w:color w:val="FF0000"/>
         </w:rPr>
-        <w:lastRenderedPageBreak/>
         <w:t>[</w:t>
       </w:r>
       <w:proofErr w:type="spellStart"/>
@@ -2560,6 +2574,7 @@
         <w:ind w:left="0" w:firstLine="0"/>
       </w:pPr>
       <w:r>
+        <w:lastRenderedPageBreak/>
         <w:t>ARTICLE 1</w:t>
       </w:r>
       <w:r>
@@ -2618,7 +2633,6 @@
         <w:ind w:left="0" w:firstLine="0"/>
       </w:pPr>
       <w:r>
-        <w:lastRenderedPageBreak/>
         <w:t>ARTICLE 1</w:t>
       </w:r>
       <w:r>
@@ -4592,6 +4606,7 @@
   <w:style w:type="character" w:default="1" w:styleId="Policepardfaut">
     <w:name w:val="Default Paragraph Font"/>
     <w:uiPriority w:val="1"/>
+    <w:semiHidden/>
     <w:unhideWhenUsed/>
   </w:style>
   <w:style w:type="table" w:default="1" w:styleId="TableauNormal">

</xml_diff>

<commit_message>
fix: balises credits/listes sans filtre SACEM + sublist/subpart/licpart Managelic via Id
BalisesGenerator.vb
- [credits] : retirer IsSignataire + IsSACEM → tous les éditeurs (SACEM + NON-SACEM)
- [auteurslist] : retirer IsSignataire → tous les A/AD
- [editeurslist] : retirer IsSACEM → signataires SACEM + NON-SACEM
- [sublist] : Managelic résolu via Id (idToDesignation) au lieu de comparaison string
  → éditeurs avec Managelic disparaissent de la liste principale
  → éditeur principal affiche "pour le compte de" les cédants

SuperbaliseGenerator.vb
- {licpart} : Managelic résolu via Id (idToAyant) comme Managesub
  → [editeurcedelic] correctement rempli
  → nettoyage virgule orpheline si [editeurcedelic] vide
- {subpart} : nettoyage virgule orpheline si [editeurcedesub] vide
  → pluriel "leur revenant" déclenché si plusieurs destinataires
</commit_message>
<xml_diff>
--- a/templates/COED_template_univ.docx
+++ b/templates/COED_template_univ.docx
@@ -714,13 +714,13 @@
         <w:spacing w:after="3"/>
         <w:ind w:left="0" w:right="27" w:firstLine="0"/>
         <w:rPr>
-          <w:rFonts w:ascii="Cambria" w:eastAsia="Cambria" w:hAnsi="Cambria" w:cs="Cambria"/>
+          <w:rFonts w:eastAsia="Cambria"/>
           <w:color w:val="EE0000"/>
         </w:rPr>
       </w:pPr>
       <w:r>
         <w:rPr>
-          <w:rFonts w:ascii="Cambria" w:eastAsia="Cambria" w:hAnsi="Cambria" w:cs="Cambria"/>
+          <w:rFonts w:eastAsia="Cambria"/>
           <w:color w:val="EE0000"/>
         </w:rPr>
         <w:t>{MENTION_NONSACEM}</w:t>
@@ -736,7 +736,7 @@
       </w:pPr>
       <w:r>
         <w:rPr>
-          <w:rFonts w:ascii="Cambria" w:eastAsia="Cambria" w:hAnsi="Cambria" w:cs="Cambria"/>
+          <w:rFonts w:eastAsia="Cambria"/>
           <w:color w:val="EE0000"/>
         </w:rPr>
         <w:t>{LIST_NONSACEM}</w:t>

</xml_diff>